<commit_message>
Discuss result limitations and supplementary video sources
</commit_message>
<xml_diff>
--- a/outputs/fresh_course_experiment/report_v1/REPORT_FRESH_REVIEW_DRAFT.docx
+++ b/outputs/fresh_course_experiment/report_v1/REPORT_FRESH_REVIEW_DRAFT.docx
@@ -163,7 +163,7 @@
           <w:i w:val="0"/>
           <w:sz w:val="22"/>
         </w:rPr>
-        <w:t>The 4090 rerun uses an isolated Linux environment with Python 3.11, PyTorch 2.7.0 plus CUDA 12.8 and Ultralytics 8.4.175. Official YOLO11n, YOLO11m, YOLO11m-pose and SAM2-t bytes are recorded with sizes and SHA256 values. YOLO11n and YOLO11m object inference use the identical 39-event source cohort, pose input, image size, thresholds and temporal rules. Model selection is based on source evidence coverage and disagreement diagnostics, never on a reference outcome.</w:t>
+        <w:t>The rerun uses an isolated Linux environment with Python 3.11, PyTorch 2.7.0 plus CUDA 12.8 and Ultralytics 8.4.175. Official YOLO11n, YOLO11m, YOLO11m-pose and SAM2-t bytes are recorded with sizes and SHA256 values. YOLO11n and YOLO11m object inference use the identical 39-event source cohort, pose input, image size, thresholds and temporal rules. Model selection is based on source evidence coverage and disagreement diagnostics, never on a reference outcome.</w:t>
       </w:r>
     </w:p>
     <w:p>
@@ -327,7 +327,7 @@
           <w:i w:val="0"/>
           <w:sz w:val="22"/>
         </w:rPr>
-        <w:t>The joint calibration stage supports 493 of 582 same-frame paired samples and 307 sparse sole projections in the medium phase comparison. These are geometric support counts, not a continuous top-down trajectory or metric distance. Fourteen events have no pre-contact ground candidate under the strict source checks. A diagnostic overlay is retained for review; the original pixels and held-out line checks are hash-bound.</w:t>
+        <w:t>The selected final joint-calibration output supports 521 of 609 sampled source frames, with 339 sparse sole candidates and 226 pre-contact ground candidates across 32 events. Seven events have no pre-contact ground candidate under the source checks. These are geometric support counts, not a continuous top-down trajectory or metric distance. A diagnostic overlay is retained for review; the original pixels and held-out line checks are hash-bound.</w:t>
       </w:r>
     </w:p>
     <w:p>
@@ -709,7 +709,7 @@
           <w:i w:val="0"/>
           <w:sz w:val="22"/>
         </w:rPr>
-        <w:t>The camera-v2 repair reuses high-resolution source-bound live tracks from the 4090 pose result when the actor, shot and contact identity match, while cross-shot queries still require their own fresh analysis. This raises the live reference continuity from 13 to 33 kicker clips and from 2 to 28 keeper clips under the fixed ten-sample guard. It changes view candidates modestly, from two to three back-of-kicker and two to eight 45-degree-right candidates, while playback remains unknown for all 320 intervals. The repair addresses a documented input bottleneck; it does not claim slow-motion classification.</w:t>
+        <w:t>The camera-v2 repair reuses high-resolution source-bound live tracks from the fresh pose result when the actor, shot and contact identity match, while cross-shot queries still require their own fresh analysis. This raises the live reference continuity from 13 to 33 kicker clips and from 2 to 28 keeper clips under the fixed ten-sample guard. It changes view candidates modestly, from two to three back-of-kicker and two to eight 45-degree-right candidates, while playback remains unknown for all 320 intervals. Of these intervals, 301 do not enter action alignment and 19 enter without sufficient role-specific alignment support. Identity and spatial-view failures therefore also limit playback classification.</w:t>
       </w:r>
     </w:p>
     <w:p>
@@ -789,7 +789,7 @@
           <w:i w:val="0"/>
           <w:sz w:val="22"/>
         </w:rPr>
-        <w:t>, and tests cover source binding, stale producer rejection, coordinate contracts, camera chains, model ablation, endpoint censoring, mask identity, scoreboard parsing and outcome conflict abstention. The full local suite passes 788 tests and 35 subtests. Passing tests establish implementation contracts, not video accuracy.</w:t>
+        <w:t>, and tests cover source binding, stale producer rejection, coordinate contracts, camera chains, model ablation, endpoint censoring, mask identity, scoreboard parsing and outcome conflict abstention. The full local suite passes 793 tests and 35 subtests. Passing tests establish implementation contracts, not video accuracy.</w:t>
       </w:r>
     </w:p>
     <w:p>
@@ -857,7 +857,7 @@
           <w:i w:val="0"/>
           <w:sz w:val="22"/>
         </w:rPr>
-        <w:t xml:space="preserve"> viewer. The viewer lets a reviewer select an event, play its hashed context clip, inspect source-image detector evidence, inspect sparse ground projections and read the component record. The bundle manifest and review manifest record every copied artifact hash. Raw videos remain outside the Git working tree and are stored only in the private release because they are course material.</w:t>
+        <w:t xml:space="preserve"> viewer. The viewer lets a reviewer select an event, inspect source-image detector evidence, inspect sparse ground projections and read the component record. Video playback additionally requires including the corresponding context clips; the committed viewer contains images and records only. The bundle manifest and review manifest record every copied artifact hash. Raw videos remain outside the Git working tree; the current source copies are stored in a draft release.</w:t>
       </w:r>
     </w:p>
     <w:p>
@@ -907,7 +907,7 @@
           <w:i w:val="0"/>
           <w:sz w:val="22"/>
         </w:rPr>
-        <w:t xml:space="preserve"> records the 4090, CUDA runtime, packages, official model receipts and source inputs. No shared lab environment was modified. A teaching-team reproduction package should include ordinary source files, documented model retrieval and permitted course data rather than requiring a private GitHub login or a student's lab account.</w:t>
+        <w:t xml:space="preserve"> records the CUDA runtime, packages, official model receipts and source inputs. A teaching-team reproduction package should include ordinary source files, documented model retrieval and permitted course data without requiring a personal account. The public repository supports saved-result EDA, while raw-video extraction still needs the original footage and intermediate stage outputs.</w:t>
       </w:r>
     </w:p>
     <w:p>

</xml_diff>